<commit_message>
Fix based on prior feedback and new screenshots
</commit_message>
<xml_diff>
--- a/sql2q1/sql2q1_images.docx
+++ b/sql2q1/sql2q1_images.docx
@@ -298,7 +298,6 @@
     <w:p>
       <w:pPr>
         <w:rPr>
-          <w:rFonts w:hint="cs"/>
           <w:rtl/>
         </w:rPr>
       </w:pPr>
@@ -470,6 +469,7 @@
     <w:p>
       <w:pPr>
         <w:rPr>
+          <w:rFonts w:hint="cs"/>
           <w:rtl/>
         </w:rPr>
       </w:pPr>
@@ -479,10 +479,10 @@
         </w:rPr>
         <w:lastRenderedPageBreak/>
         <w:drawing>
-          <wp:inline distT="0" distB="0" distL="0" distR="0" wp14:anchorId="23487E24" wp14:editId="57530FBA">
-            <wp:extent cx="5274310" cy="726440"/>
-            <wp:effectExtent l="0" t="0" r="2540" b="0"/>
-            <wp:docPr id="9" name="תמונה 9"/>
+          <wp:inline distT="0" distB="0" distL="0" distR="0" wp14:anchorId="33A1F7F5" wp14:editId="097962E9">
+            <wp:extent cx="5076825" cy="1828800"/>
+            <wp:effectExtent l="0" t="0" r="9525" b="0"/>
+            <wp:docPr id="10" name="תמונה 10"/>
             <wp:cNvGraphicFramePr>
               <a:graphicFrameLocks xmlns:a="http://schemas.openxmlformats.org/drawingml/2006/main" noChangeAspect="1"/>
             </wp:cNvGraphicFramePr>
@@ -502,7 +502,7 @@
                   <pic:spPr>
                     <a:xfrm>
                       <a:off x="0" y="0"/>
-                      <a:ext cx="5274310" cy="726440"/>
+                      <a:ext cx="5076825" cy="1828800"/>
                     </a:xfrm>
                     <a:prstGeom prst="rect">
                       <a:avLst/>
@@ -564,8 +564,21 @@
     </w:p>
     <w:p>
       <w:r>
-        <w:t>After running:</w:t>
-      </w:r>
+        <w:t xml:space="preserve">After </w:t>
+      </w:r>
+      <w:proofErr w:type="gramStart"/>
+      <w:r>
+        <w:t>updating :</w:t>
+      </w:r>
+      <w:proofErr w:type="gramEnd"/>
+    </w:p>
+    <w:p>
+      <w:pPr>
+        <w:rPr>
+          <w:rFonts w:hint="cs"/>
+          <w:rtl/>
+        </w:rPr>
+      </w:pPr>
     </w:p>
     <w:p>
       <w:pPr>
@@ -578,10 +591,10 @@
           <w:noProof/>
         </w:rPr>
         <w:drawing>
-          <wp:inline distT="0" distB="0" distL="0" distR="0" wp14:anchorId="53100596" wp14:editId="689B17BB">
-            <wp:extent cx="2209800" cy="828675"/>
-            <wp:effectExtent l="0" t="0" r="0" b="9525"/>
-            <wp:docPr id="12" name="תמונה 12"/>
+          <wp:inline distT="0" distB="0" distL="0" distR="0" wp14:anchorId="7CA49582" wp14:editId="430E2AAB">
+            <wp:extent cx="1933575" cy="800100"/>
+            <wp:effectExtent l="0" t="0" r="9525" b="0"/>
+            <wp:docPr id="14" name="תמונה 14"/>
             <wp:cNvGraphicFramePr>
               <a:graphicFrameLocks xmlns:a="http://schemas.openxmlformats.org/drawingml/2006/main" noChangeAspect="1"/>
             </wp:cNvGraphicFramePr>
@@ -601,7 +614,7 @@
                   <pic:spPr>
                     <a:xfrm>
                       <a:off x="0" y="0"/>
-                      <a:ext cx="2209800" cy="828675"/>
+                      <a:ext cx="1933575" cy="800100"/>
                     </a:xfrm>
                     <a:prstGeom prst="rect">
                       <a:avLst/>
@@ -615,21 +628,13 @@
       </w:r>
     </w:p>
     <w:p>
-      <w:pPr>
-        <w:rPr>
-          <w:rtl/>
-        </w:rPr>
-      </w:pPr>
-    </w:p>
-    <w:p>
-      <w:r>
-        <w:t>We got:</w:t>
-      </w:r>
-    </w:p>
-    <w:p>
-      <w:pPr>
-        <w:rPr>
-          <w:rFonts w:hint="cs"/>
+      <w:r>
+        <w:t>We got</w:t>
+      </w:r>
+    </w:p>
+    <w:p>
+      <w:pPr>
+        <w:rPr>
           <w:rtl/>
         </w:rPr>
       </w:pPr>
@@ -638,10 +643,10 @@
           <w:noProof/>
         </w:rPr>
         <w:drawing>
-          <wp:inline distT="0" distB="0" distL="0" distR="0" wp14:anchorId="6E7B24EE" wp14:editId="2B1C9448">
-            <wp:extent cx="3933825" cy="676275"/>
-            <wp:effectExtent l="0" t="0" r="9525" b="9525"/>
-            <wp:docPr id="13" name="תמונה 13"/>
+          <wp:inline distT="0" distB="0" distL="0" distR="0" wp14:anchorId="2C42DEBE" wp14:editId="5AC61356">
+            <wp:extent cx="2933700" cy="723900"/>
+            <wp:effectExtent l="0" t="0" r="0" b="0"/>
+            <wp:docPr id="15" name="תמונה 15"/>
             <wp:cNvGraphicFramePr>
               <a:graphicFrameLocks xmlns:a="http://schemas.openxmlformats.org/drawingml/2006/main" noChangeAspect="1"/>
             </wp:cNvGraphicFramePr>
@@ -661,7 +666,124 @@
                   <pic:spPr>
                     <a:xfrm>
                       <a:off x="0" y="0"/>
-                      <a:ext cx="3933825" cy="676275"/>
+                      <a:ext cx="2933700" cy="723900"/>
+                    </a:xfrm>
+                    <a:prstGeom prst="rect">
+                      <a:avLst/>
+                    </a:prstGeom>
+                  </pic:spPr>
+                </pic:pic>
+              </a:graphicData>
+            </a:graphic>
+          </wp:inline>
+        </w:drawing>
+      </w:r>
+    </w:p>
+    <w:p>
+      <w:pPr>
+        <w:rPr>
+          <w:rtl/>
+        </w:rPr>
+      </w:pPr>
+    </w:p>
+    <w:p>
+      <w:r>
+        <w:t xml:space="preserve">After </w:t>
+      </w:r>
+      <w:proofErr w:type="gramStart"/>
+      <w:r>
+        <w:t>delete :</w:t>
+      </w:r>
+      <w:proofErr w:type="gramEnd"/>
+    </w:p>
+    <w:p>
+      <w:pPr>
+        <w:rPr>
+          <w:rtl/>
+        </w:rPr>
+      </w:pPr>
+      <w:r>
+        <w:rPr>
+          <w:noProof/>
+        </w:rPr>
+        <w:drawing>
+          <wp:inline distT="0" distB="0" distL="0" distR="0" wp14:anchorId="646EA5E9" wp14:editId="38A6C331">
+            <wp:extent cx="3695700" cy="533400"/>
+            <wp:effectExtent l="0" t="0" r="0" b="0"/>
+            <wp:docPr id="16" name="תמונה 16"/>
+            <wp:cNvGraphicFramePr>
+              <a:graphicFrameLocks xmlns:a="http://schemas.openxmlformats.org/drawingml/2006/main" noChangeAspect="1"/>
+            </wp:cNvGraphicFramePr>
+            <a:graphic xmlns:a="http://schemas.openxmlformats.org/drawingml/2006/main">
+              <a:graphicData uri="http://schemas.openxmlformats.org/drawingml/2006/picture">
+                <pic:pic xmlns:pic="http://schemas.openxmlformats.org/drawingml/2006/picture">
+                  <pic:nvPicPr>
+                    <pic:cNvPr id="1" name=""/>
+                    <pic:cNvPicPr/>
+                  </pic:nvPicPr>
+                  <pic:blipFill>
+                    <a:blip r:embed="rId16"/>
+                    <a:stretch>
+                      <a:fillRect/>
+                    </a:stretch>
+                  </pic:blipFill>
+                  <pic:spPr>
+                    <a:xfrm>
+                      <a:off x="0" y="0"/>
+                      <a:ext cx="3695700" cy="533400"/>
+                    </a:xfrm>
+                    <a:prstGeom prst="rect">
+                      <a:avLst/>
+                    </a:prstGeom>
+                  </pic:spPr>
+                </pic:pic>
+              </a:graphicData>
+            </a:graphic>
+          </wp:inline>
+        </w:drawing>
+      </w:r>
+    </w:p>
+    <w:p>
+      <w:r>
+        <w:t>We got</w:t>
+      </w:r>
+    </w:p>
+    <w:p>
+      <w:pPr>
+        <w:rPr>
+          <w:rFonts w:hint="cs"/>
+          <w:rtl/>
+        </w:rPr>
+      </w:pPr>
+      <w:r>
+        <w:rPr>
+          <w:noProof/>
+        </w:rPr>
+        <w:drawing>
+          <wp:inline distT="0" distB="0" distL="0" distR="0" wp14:anchorId="79040E65" wp14:editId="164FA993">
+            <wp:extent cx="2886075" cy="704850"/>
+            <wp:effectExtent l="0" t="0" r="9525" b="0"/>
+            <wp:docPr id="17" name="תמונה 17"/>
+            <wp:cNvGraphicFramePr>
+              <a:graphicFrameLocks xmlns:a="http://schemas.openxmlformats.org/drawingml/2006/main" noChangeAspect="1"/>
+            </wp:cNvGraphicFramePr>
+            <a:graphic xmlns:a="http://schemas.openxmlformats.org/drawingml/2006/main">
+              <a:graphicData uri="http://schemas.openxmlformats.org/drawingml/2006/picture">
+                <pic:pic xmlns:pic="http://schemas.openxmlformats.org/drawingml/2006/picture">
+                  <pic:nvPicPr>
+                    <pic:cNvPr id="1" name=""/>
+                    <pic:cNvPicPr/>
+                  </pic:nvPicPr>
+                  <pic:blipFill>
+                    <a:blip r:embed="rId17"/>
+                    <a:stretch>
+                      <a:fillRect/>
+                    </a:stretch>
+                  </pic:blipFill>
+                  <pic:spPr>
+                    <a:xfrm>
+                      <a:off x="0" y="0"/>
+                      <a:ext cx="2886075" cy="704850"/>
                     </a:xfrm>
                     <a:prstGeom prst="rect">
                       <a:avLst/>

</xml_diff>